<commit_message>
fix: remove KaTeX auto-render corrupting Vietnamese parentheses, enforce single native system font, and update Rule.md
</commit_message>
<xml_diff>
--- a/OUTPUT/SO_THEO_DOI_TIEP_CONG_DAN_ND154_ND30.docx
+++ b/OUTPUT/SO_THEO_DOI_TIEP_CONG_DAN_ND154_ND30.docx
@@ -25,7 +25,7 @@
             </w:tcBorders>
             <w:tcMar>
               <w:top w:w="0" w:type="dxa"/>
-              <w:bottom w:w="40" w:type="dxa"/>
+              <w:bottom w:w="30" w:type="dxa"/>
               <w:left w:w="0" w:type="dxa"/>
               <w:right w:w="20" w:type="dxa"/>
             </w:tcMar>
@@ -98,7 +98,7 @@
             </w:tcBorders>
             <w:tcMar>
               <w:top w:w="0" w:type="dxa"/>
-              <w:bottom w:w="40" w:type="dxa"/>
+              <w:bottom w:w="30" w:type="dxa"/>
               <w:left w:w="20" w:type="dxa"/>
               <w:right w:w="0" w:type="dxa"/>
             </w:tcMar>
@@ -164,7 +164,7 @@
     </w:tbl>
     <w:p>
       <w:pPr>
-        <w:spacing w:before="280" w:after="40" w:line="276" w:lineRule="auto"/>
+        <w:spacing w:before="240" w:after="40" w:line="276" w:lineRule="auto"/>
         <w:jc w:val="center"/>
       </w:pPr>
       <w:r>
@@ -253,6 +253,7 @@
               <w:spacing w:line="252" w:lineRule="auto" w:before="40" w:after="40"/>
               <w:jc w:val="center"/>
             </w:pPr>
+            <w:r/>
             <w:r>
               <w:rPr>
                 <w:rFonts w:ascii="Times New Roman" w:hAnsi="Times New Roman"/>
@@ -267,13 +268,13 @@
               <w:spacing w:line="252" w:lineRule="auto" w:before="40" w:after="40"/>
               <w:jc w:val="center"/>
             </w:pPr>
+            <w:r/>
             <w:r>
               <w:rPr>
                 <w:rFonts w:ascii="Times New Roman" w:hAnsi="Times New Roman"/>
                 <w:b/>
                 <w:sz w:val="20"/>
               </w:rPr>
-              <w:t>STT</w:t>
             </w:r>
           </w:p>
         </w:tc>
@@ -295,6 +296,7 @@
               <w:spacing w:line="252" w:lineRule="auto" w:before="40" w:after="40"/>
               <w:jc w:val="center"/>
             </w:pPr>
+            <w:r/>
             <w:r>
               <w:rPr>
                 <w:rFonts w:ascii="Times New Roman" w:hAnsi="Times New Roman"/>
@@ -309,13 +311,13 @@
               <w:spacing w:line="252" w:lineRule="auto" w:before="40" w:after="40"/>
               <w:jc w:val="center"/>
             </w:pPr>
+            <w:r/>
             <w:r>
               <w:rPr>
                 <w:rFonts w:ascii="Times New Roman" w:hAnsi="Times New Roman"/>
                 <w:b/>
                 <w:sz w:val="21"/>
               </w:rPr>
-              <w:t>THÔNG TIN BUỔI TIẾP</w:t>
             </w:r>
           </w:p>
         </w:tc>
@@ -337,13 +339,16 @@
               <w:spacing w:line="252" w:lineRule="auto" w:before="40" w:after="40"/>
               <w:jc w:val="center"/>
             </w:pPr>
+            <w:r/>
             <w:r>
               <w:rPr>
                 <w:rFonts w:ascii="Times New Roman" w:hAnsi="Times New Roman"/>
                 <w:b/>
-                <w:sz w:val="21"/>
+                <w:sz w:val="20"/>
               </w:rPr>
               <w:t>THÔNG TIN CÔNG DÂN</w:t>
+              <w:br/>
+              <w:t>(Họ tên, CCCD/SĐT, Địa chỉ)</w:t>
             </w:r>
           </w:p>
           <w:p>
@@ -351,15 +356,13 @@
               <w:spacing w:line="252" w:lineRule="auto" w:before="40" w:after="40"/>
               <w:jc w:val="center"/>
             </w:pPr>
+            <w:r/>
             <w:r>
               <w:rPr>
                 <w:rFonts w:ascii="Times New Roman" w:hAnsi="Times New Roman"/>
                 <w:b/>
-                <w:sz w:val="19"/>
+                <w:sz w:val="20"/>
               </w:rPr>
-              <w:t>Họ tên, CCCD/SĐT</w:t>
-              <w:br/>
-              <w:t>&amp; Địa chỉ công dân</w:t>
             </w:r>
           </w:p>
         </w:tc>
@@ -381,13 +384,16 @@
               <w:spacing w:line="252" w:lineRule="auto" w:before="40" w:after="40"/>
               <w:jc w:val="center"/>
             </w:pPr>
+            <w:r/>
             <w:r>
               <w:rPr>
                 <w:rFonts w:ascii="Times New Roman" w:hAnsi="Times New Roman"/>
                 <w:b/>
-                <w:sz w:val="21"/>
+                <w:sz w:val="20"/>
               </w:rPr>
               <w:t>NỘI DUNG VỤ VIỆC &amp; TRAO ĐỔI</w:t>
+              <w:br/>
+              <w:t>(Tóm tắt nội dung đối thoại, loại đơn)</w:t>
             </w:r>
           </w:p>
           <w:p>
@@ -395,15 +401,13 @@
               <w:spacing w:line="252" w:lineRule="auto" w:before="40" w:after="40"/>
               <w:jc w:val="center"/>
             </w:pPr>
+            <w:r/>
             <w:r>
               <w:rPr>
                 <w:rFonts w:ascii="Times New Roman" w:hAnsi="Times New Roman"/>
                 <w:b/>
-                <w:sz w:val="19"/>
+                <w:sz w:val="20"/>
               </w:rPr>
-              <w:t>Tóm tắt nội dung trao đổi,</w:t>
-              <w:br/>
-              <w:t>đối thoại &amp; Phân loại đơn</w:t>
             </w:r>
           </w:p>
         </w:tc>
@@ -425,6 +429,7 @@
               <w:spacing w:line="252" w:lineRule="auto" w:before="40" w:after="40"/>
               <w:jc w:val="center"/>
             </w:pPr>
+            <w:r/>
             <w:r>
               <w:rPr>
                 <w:rFonts w:ascii="Times New Roman" w:hAnsi="Times New Roman"/>
@@ -439,13 +444,13 @@
               <w:spacing w:line="252" w:lineRule="auto" w:before="40" w:after="40"/>
               <w:jc w:val="center"/>
             </w:pPr>
+            <w:r/>
             <w:r>
               <w:rPr>
                 <w:rFonts w:ascii="Times New Roman" w:hAnsi="Times New Roman"/>
                 <w:b/>
                 <w:sz w:val="21"/>
               </w:rPr>
-              <w:t>CHỈ ĐẠO, QUÁ TRÌNH XỬ LÝ &amp; KẾT QUẢ GIẢI QUYẾT</w:t>
             </w:r>
           </w:p>
           <w:p>
@@ -453,13 +458,13 @@
               <w:spacing w:line="252" w:lineRule="auto" w:before="40" w:after="40"/>
               <w:jc w:val="center"/>
             </w:pPr>
+            <w:r/>
             <w:r>
               <w:rPr>
                 <w:rFonts w:ascii="Times New Roman" w:hAnsi="Times New Roman"/>
                 <w:b/>
                 <w:sz w:val="21"/>
               </w:rPr>
-              <w:t>CHỈ ĐẠO, QUÁ TRÌNH XỬ LÝ &amp; KẾT QUẢ GIẢI QUYẾT</w:t>
             </w:r>
           </w:p>
         </w:tc>
@@ -481,13 +486,16 @@
               <w:spacing w:line="252" w:lineRule="auto" w:before="40" w:after="40"/>
               <w:jc w:val="center"/>
             </w:pPr>
+            <w:r/>
             <w:r>
               <w:rPr>
                 <w:rFonts w:ascii="Times New Roman" w:hAnsi="Times New Roman"/>
                 <w:b/>
-                <w:sz w:val="21"/>
+                <w:sz w:val="20"/>
               </w:rPr>
               <w:t>GHI CHÚ</w:t>
+              <w:br/>
+              <w:t>(Hồ sơ lưu)</w:t>
             </w:r>
           </w:p>
           <w:p>
@@ -495,15 +503,13 @@
               <w:spacing w:line="252" w:lineRule="auto" w:before="40" w:after="40"/>
               <w:jc w:val="center"/>
             </w:pPr>
+            <w:r/>
             <w:r>
               <w:rPr>
                 <w:rFonts w:ascii="Times New Roman" w:hAnsi="Times New Roman"/>
                 <w:b/>
-                <w:sz w:val="19"/>
+                <w:sz w:val="20"/>
               </w:rPr>
-              <w:t>Ghi chú</w:t>
-              <w:br/>
-              <w:t>(Hồ sơ lưu)</w:t>
             </w:r>
           </w:p>
         </w:tc>
@@ -545,6 +551,7 @@
               <w:spacing w:line="252" w:lineRule="auto" w:before="40" w:after="40"/>
               <w:jc w:val="center"/>
             </w:pPr>
+            <w:r/>
             <w:r>
               <w:rPr>
                 <w:rFonts w:ascii="Times New Roman" w:hAnsi="Times New Roman"/>
@@ -574,6 +581,7 @@
               <w:spacing w:line="252" w:lineRule="auto" w:before="40" w:after="40"/>
               <w:jc w:val="center"/>
             </w:pPr>
+            <w:r/>
             <w:r>
               <w:rPr>
                 <w:rFonts w:ascii="Times New Roman" w:hAnsi="Times New Roman"/>
@@ -633,6 +641,7 @@
               <w:spacing w:line="252" w:lineRule="auto" w:before="40" w:after="40"/>
               <w:jc w:val="center"/>
             </w:pPr>
+            <w:r/>
             <w:r>
               <w:rPr>
                 <w:rFonts w:ascii="Times New Roman" w:hAnsi="Times New Roman"/>
@@ -662,6 +671,7 @@
               <w:spacing w:line="252" w:lineRule="auto" w:before="40" w:after="40"/>
               <w:jc w:val="center"/>
             </w:pPr>
+            <w:r/>
             <w:r>
               <w:rPr>
                 <w:rFonts w:ascii="Times New Roman" w:hAnsi="Times New Roman"/>
@@ -691,6 +701,7 @@
               <w:spacing w:line="252" w:lineRule="auto" w:before="40" w:after="40"/>
               <w:jc w:val="center"/>
             </w:pPr>
+            <w:r/>
             <w:r>
               <w:rPr>
                 <w:rFonts w:ascii="Times New Roman" w:hAnsi="Times New Roman"/>
@@ -741,6 +752,7 @@
               <w:spacing w:line="252" w:lineRule="auto" w:before="40" w:after="40"/>
               <w:jc w:val="center"/>
             </w:pPr>
+            <w:r/>
             <w:r>
               <w:rPr>
                 <w:rFonts w:ascii="Times New Roman" w:hAnsi="Times New Roman"/>
@@ -768,6 +780,7 @@
               <w:spacing w:line="252" w:lineRule="auto" w:before="40" w:after="40"/>
               <w:jc w:val="center"/>
             </w:pPr>
+            <w:r/>
             <w:r>
               <w:rPr>
                 <w:rFonts w:ascii="Times New Roman" w:hAnsi="Times New Roman"/>
@@ -795,6 +808,7 @@
               <w:spacing w:line="252" w:lineRule="auto" w:before="40" w:after="40"/>
               <w:jc w:val="center"/>
             </w:pPr>
+            <w:r/>
             <w:r>
               <w:rPr>
                 <w:rFonts w:ascii="Times New Roman" w:hAnsi="Times New Roman"/>
@@ -822,6 +836,7 @@
               <w:spacing w:line="252" w:lineRule="auto" w:before="40" w:after="40"/>
               <w:jc w:val="center"/>
             </w:pPr>
+            <w:r/>
             <w:r>
               <w:rPr>
                 <w:rFonts w:ascii="Times New Roman" w:hAnsi="Times New Roman"/>
@@ -849,6 +864,7 @@
               <w:spacing w:line="252" w:lineRule="auto" w:before="40" w:after="40"/>
               <w:jc w:val="center"/>
             </w:pPr>
+            <w:r/>
             <w:r>
               <w:rPr>
                 <w:rFonts w:ascii="Times New Roman" w:hAnsi="Times New Roman"/>
@@ -876,6 +892,7 @@
               <w:spacing w:line="252" w:lineRule="auto" w:before="40" w:after="40"/>
               <w:jc w:val="center"/>
             </w:pPr>
+            <w:r/>
             <w:r>
               <w:rPr>
                 <w:rFonts w:ascii="Times New Roman" w:hAnsi="Times New Roman"/>
@@ -903,6 +920,7 @@
               <w:spacing w:line="252" w:lineRule="auto" w:before="40" w:after="40"/>
               <w:jc w:val="center"/>
             </w:pPr>
+            <w:r/>
             <w:r>
               <w:rPr>
                 <w:rFonts w:ascii="Times New Roman" w:hAnsi="Times New Roman"/>
@@ -930,6 +948,7 @@
               <w:spacing w:line="252" w:lineRule="auto" w:before="40" w:after="40"/>
               <w:jc w:val="center"/>
             </w:pPr>
+            <w:r/>
             <w:r>
               <w:rPr>
                 <w:rFonts w:ascii="Times New Roman" w:hAnsi="Times New Roman"/>
@@ -957,6 +976,7 @@
               <w:spacing w:line="252" w:lineRule="auto" w:before="40" w:after="40"/>
               <w:jc w:val="center"/>
             </w:pPr>
+            <w:r/>
             <w:r>
               <w:rPr>
                 <w:rFonts w:ascii="Times New Roman" w:hAnsi="Times New Roman"/>
@@ -988,6 +1008,7 @@
               <w:spacing w:line="276" w:lineRule="auto" w:before="20" w:after="40"/>
               <w:jc w:val="center"/>
             </w:pPr>
+            <w:r/>
             <w:r>
               <w:rPr>
                 <w:rFonts w:ascii="Times New Roman" w:hAnsi="Times New Roman"/>
@@ -1014,6 +1035,7 @@
               <w:spacing w:line="276" w:lineRule="auto" w:before="20" w:after="40"/>
               <w:jc w:val="center"/>
             </w:pPr>
+            <w:r/>
             <w:r>
               <w:rPr>
                 <w:rFonts w:ascii="Times New Roman" w:hAnsi="Times New Roman"/>
@@ -1052,6 +1074,7 @@
               <w:spacing w:line="276" w:lineRule="auto" w:before="20" w:after="40"/>
               <w:jc w:val="left"/>
             </w:pPr>
+            <w:r/>
             <w:r>
               <w:rPr>
                 <w:rFonts w:ascii="Times New Roman" w:hAnsi="Times New Roman"/>
@@ -1104,6 +1127,7 @@
               <w:spacing w:line="276" w:lineRule="auto" w:before="20" w:after="40"/>
               <w:jc w:val="left"/>
             </w:pPr>
+            <w:r/>
             <w:r>
               <w:rPr>
                 <w:rFonts w:ascii="Times New Roman" w:hAnsi="Times New Roman"/>
@@ -1182,13 +1206,14 @@
               <w:spacing w:line="276" w:lineRule="auto" w:before="20" w:after="40"/>
               <w:jc w:val="left"/>
             </w:pPr>
+            <w:r/>
             <w:r>
               <w:rPr>
                 <w:rFonts w:ascii="Times New Roman" w:hAnsi="Times New Roman"/>
                 <w:b/>
                 <w:sz w:val="19"/>
               </w:rPr>
-              <w:t>- Nội dung trao đổi: Khiếu nại hồ sơ xin chuyển mục đích sử dụng 150m² đất và cấp đổi GCN bị trễ hạn 15 ngày so với phiếu hẹn. Bức xúc do cần làm thủ tục vay vốn ngân hàng.</w:t>
+              <w:t>- Nội dung trao đổi: Khiếu nại hồ sơ xin chuyển mục đích sử dụng 150m² đất nông nghiệp sang đất ở và cấp đổi GCN bị trễ hạn 15 ngày so với phiếu hẹn. Công dân cần GCN để vay vốn ngân hàng.</w:t>
             </w:r>
           </w:p>
           <w:p>
@@ -1222,6 +1247,7 @@
               <w:spacing w:line="276" w:lineRule="auto" w:before="20" w:after="40"/>
               <w:jc w:val="left"/>
             </w:pPr>
+            <w:r/>
             <w:r>
               <w:rPr>
                 <w:rFonts w:ascii="Times New Roman" w:hAnsi="Times New Roman"/>
@@ -1261,12 +1287,13 @@
               <w:spacing w:line="276" w:lineRule="auto" w:before="20" w:after="40"/>
               <w:jc w:val="left"/>
             </w:pPr>
+            <w:r/>
             <w:r>
               <w:rPr>
                 <w:rFonts w:ascii="Times New Roman" w:hAnsi="Times New Roman"/>
                 <w:sz w:val="19"/>
               </w:rPr>
-              <w:t>- Ngày 06/10: Tổ Kỹ thuật kiểm tra thực địa và nguồn gốc đất.</w:t>
+              <w:t>- Ngày 06/10: Tổ Kỹ thuật kiểm tra thực địa và hồ sơ địa chính.</w:t>
             </w:r>
           </w:p>
           <w:p>
@@ -1312,6 +1339,7 @@
               <w:spacing w:line="276" w:lineRule="auto" w:before="20" w:after="40"/>
               <w:jc w:val="left"/>
             </w:pPr>
+            <w:r/>
             <w:r>
               <w:rPr>
                 <w:rFonts w:ascii="Times New Roman" w:hAnsi="Times New Roman"/>
@@ -1378,12 +1406,13 @@
               <w:spacing w:line="276" w:lineRule="auto" w:before="20" w:after="40"/>
               <w:jc w:val="center"/>
             </w:pPr>
+            <w:r/>
             <w:r>
               <w:rPr>
                 <w:rFonts w:ascii="Times New Roman" w:hAnsi="Times New Roman"/>
                 <w:sz w:val="19"/>
               </w:rPr>
-              <w:t>Lưu hồ sơ số: 142/KN</w:t>
+              <w:t>Lưu hồ sơ: 142/KN</w:t>
             </w:r>
           </w:p>
         </w:tc>
@@ -1409,6 +1438,7 @@
               <w:spacing w:line="276" w:lineRule="auto" w:before="20" w:after="40"/>
               <w:jc w:val="center"/>
             </w:pPr>
+            <w:r/>
             <w:r>
               <w:rPr>
                 <w:rFonts w:ascii="Times New Roman" w:hAnsi="Times New Roman"/>
@@ -1436,6 +1466,7 @@
               <w:spacing w:line="276" w:lineRule="auto" w:before="20" w:after="40"/>
               <w:jc w:val="center"/>
             </w:pPr>
+            <w:r/>
             <w:r>
               <w:rPr>
                 <w:rFonts w:ascii="Times New Roman" w:hAnsi="Times New Roman"/>
@@ -1475,6 +1506,7 @@
               <w:spacing w:line="276" w:lineRule="auto" w:before="20" w:after="40"/>
               <w:jc w:val="left"/>
             </w:pPr>
+            <w:r/>
             <w:r>
               <w:rPr>
                 <w:rFonts w:ascii="Times New Roman" w:hAnsi="Times New Roman"/>
@@ -1528,6 +1560,7 @@
               <w:spacing w:line="276" w:lineRule="auto" w:before="20" w:after="40"/>
               <w:jc w:val="left"/>
             </w:pPr>
+            <w:r/>
             <w:r>
               <w:rPr>
                 <w:rFonts w:ascii="Times New Roman" w:hAnsi="Times New Roman"/>
@@ -1607,6 +1640,7 @@
               <w:spacing w:line="276" w:lineRule="auto" w:before="20" w:after="40"/>
               <w:jc w:val="left"/>
             </w:pPr>
+            <w:r/>
             <w:r>
               <w:rPr>
                 <w:rFonts w:ascii="Times New Roman" w:hAnsi="Times New Roman"/>
@@ -1648,6 +1682,7 @@
               <w:spacing w:line="276" w:lineRule="auto" w:before="20" w:after="40"/>
               <w:jc w:val="left"/>
             </w:pPr>
+            <w:r/>
             <w:r>
               <w:rPr>
                 <w:rFonts w:ascii="Times New Roman" w:hAnsi="Times New Roman"/>
@@ -1688,6 +1723,7 @@
               <w:spacing w:line="276" w:lineRule="auto" w:before="20" w:after="40"/>
               <w:jc w:val="left"/>
             </w:pPr>
+            <w:r/>
             <w:r>
               <w:rPr>
                 <w:rFonts w:ascii="Times New Roman" w:hAnsi="Times New Roman"/>
@@ -1727,6 +1763,7 @@
               <w:spacing w:line="276" w:lineRule="auto" w:before="20" w:after="40"/>
               <w:jc w:val="left"/>
             </w:pPr>
+            <w:r/>
             <w:r>
               <w:rPr>
                 <w:rFonts w:ascii="Times New Roman" w:hAnsi="Times New Roman"/>
@@ -1781,6 +1818,7 @@
               <w:spacing w:line="276" w:lineRule="auto" w:before="20" w:after="40"/>
               <w:jc w:val="center"/>
             </w:pPr>
+            <w:r/>
             <w:r>
               <w:rPr>
                 <w:rFonts w:ascii="Times New Roman" w:hAnsi="Times New Roman"/>
@@ -1811,6 +1849,7 @@
               <w:spacing w:line="276" w:lineRule="auto" w:before="20" w:after="40"/>
               <w:jc w:val="center"/>
             </w:pPr>
+            <w:r/>
             <w:r>
               <w:rPr>
                 <w:rFonts w:ascii="Times New Roman" w:hAnsi="Times New Roman"/>
@@ -1837,6 +1876,7 @@
               <w:spacing w:line="276" w:lineRule="auto" w:before="20" w:after="40"/>
               <w:jc w:val="center"/>
             </w:pPr>
+            <w:r/>
             <w:r>
               <w:rPr>
                 <w:rFonts w:ascii="Times New Roman" w:hAnsi="Times New Roman"/>
@@ -1875,6 +1915,7 @@
               <w:spacing w:line="276" w:lineRule="auto" w:before="20" w:after="40"/>
               <w:jc w:val="left"/>
             </w:pPr>
+            <w:r/>
             <w:r>
               <w:rPr>
                 <w:rFonts w:ascii="Times New Roman" w:hAnsi="Times New Roman"/>
@@ -1927,6 +1968,7 @@
               <w:spacing w:line="276" w:lineRule="auto" w:before="20" w:after="40"/>
               <w:jc w:val="left"/>
             </w:pPr>
+            <w:r/>
             <w:r>
               <w:rPr>
                 <w:rFonts w:ascii="Times New Roman" w:hAnsi="Times New Roman"/>
@@ -2019,6 +2061,7 @@
               <w:spacing w:line="276" w:lineRule="auto" w:before="20" w:after="40"/>
               <w:jc w:val="left"/>
             </w:pPr>
+            <w:r/>
             <w:r>
               <w:rPr>
                 <w:rFonts w:ascii="Times New Roman" w:hAnsi="Times New Roman"/>
@@ -2059,6 +2102,7 @@
               <w:spacing w:line="276" w:lineRule="auto" w:before="20" w:after="40"/>
               <w:jc w:val="left"/>
             </w:pPr>
+            <w:r/>
             <w:r>
               <w:rPr>
                 <w:rFonts w:ascii="Times New Roman" w:hAnsi="Times New Roman"/>
@@ -2098,6 +2142,7 @@
               <w:spacing w:line="276" w:lineRule="auto" w:before="20" w:after="40"/>
               <w:jc w:val="left"/>
             </w:pPr>
+            <w:r/>
             <w:r>
               <w:rPr>
                 <w:rFonts w:ascii="Times New Roman" w:hAnsi="Times New Roman"/>
@@ -2136,6 +2181,7 @@
               <w:spacing w:line="276" w:lineRule="auto" w:before="20" w:after="40"/>
               <w:jc w:val="left"/>
             </w:pPr>
+            <w:r/>
             <w:r>
               <w:rPr>
                 <w:rFonts w:ascii="Times New Roman" w:hAnsi="Times New Roman"/>
@@ -2189,6 +2235,7 @@
               <w:spacing w:line="276" w:lineRule="auto" w:before="20" w:after="40"/>
               <w:jc w:val="center"/>
             </w:pPr>
+            <w:r/>
             <w:r>
               <w:rPr>
                 <w:rFonts w:ascii="Times New Roman" w:hAnsi="Times New Roman"/>
@@ -2220,6 +2267,7 @@
               <w:spacing w:line="276" w:lineRule="auto" w:before="20" w:after="40"/>
               <w:jc w:val="center"/>
             </w:pPr>
+            <w:r/>
             <w:r>
               <w:rPr>
                 <w:rFonts w:ascii="Times New Roman" w:hAnsi="Times New Roman"/>
@@ -2247,6 +2295,7 @@
               <w:spacing w:line="276" w:lineRule="auto" w:before="20" w:after="40"/>
               <w:jc w:val="center"/>
             </w:pPr>
+            <w:r/>
             <w:r>
               <w:rPr>
                 <w:rFonts w:ascii="Times New Roman" w:hAnsi="Times New Roman"/>
@@ -2286,6 +2335,7 @@
               <w:spacing w:line="276" w:lineRule="auto" w:before="20" w:after="40"/>
               <w:jc w:val="left"/>
             </w:pPr>
+            <w:r/>
             <w:r>
               <w:rPr>
                 <w:rFonts w:ascii="Times New Roman" w:hAnsi="Times New Roman"/>
@@ -2339,6 +2389,7 @@
               <w:spacing w:line="276" w:lineRule="auto" w:before="20" w:after="40"/>
               <w:jc w:val="left"/>
             </w:pPr>
+            <w:r/>
             <w:r>
               <w:rPr>
                 <w:rFonts w:ascii="Times New Roman" w:hAnsi="Times New Roman"/>
@@ -2418,6 +2469,7 @@
               <w:spacing w:line="276" w:lineRule="auto" w:before="20" w:after="40"/>
               <w:jc w:val="left"/>
             </w:pPr>
+            <w:r/>
             <w:r>
               <w:rPr>
                 <w:rFonts w:ascii="Times New Roman" w:hAnsi="Times New Roman"/>
@@ -2459,6 +2511,7 @@
               <w:spacing w:line="276" w:lineRule="auto" w:before="20" w:after="40"/>
               <w:jc w:val="left"/>
             </w:pPr>
+            <w:r/>
             <w:r>
               <w:rPr>
                 <w:rFonts w:ascii="Times New Roman" w:hAnsi="Times New Roman"/>
@@ -2486,6 +2539,7 @@
               <w:spacing w:line="276" w:lineRule="auto" w:before="20" w:after="40"/>
               <w:jc w:val="left"/>
             </w:pPr>
+            <w:r/>
             <w:r>
               <w:rPr>
                 <w:rFonts w:ascii="Times New Roman" w:hAnsi="Times New Roman"/>
@@ -2525,6 +2579,7 @@
               <w:spacing w:line="276" w:lineRule="auto" w:before="20" w:after="40"/>
               <w:jc w:val="left"/>
             </w:pPr>
+            <w:r/>
             <w:r>
               <w:rPr>
                 <w:rFonts w:ascii="Times New Roman" w:hAnsi="Times New Roman"/>
@@ -2577,6 +2632,7 @@
               <w:spacing w:line="276" w:lineRule="auto" w:before="20" w:after="40"/>
               <w:jc w:val="center"/>
             </w:pPr>
+            <w:r/>
             <w:r>
               <w:rPr>
                 <w:rFonts w:ascii="Times New Roman" w:hAnsi="Times New Roman"/>
@@ -2607,6 +2663,7 @@
               <w:spacing w:line="276" w:lineRule="auto" w:before="20" w:after="40"/>
               <w:jc w:val="center"/>
             </w:pPr>
+            <w:r/>
             <w:r>
               <w:rPr>
                 <w:rFonts w:ascii="Times New Roman" w:hAnsi="Times New Roman"/>
@@ -2633,6 +2690,7 @@
               <w:spacing w:line="276" w:lineRule="auto" w:before="20" w:after="40"/>
               <w:jc w:val="center"/>
             </w:pPr>
+            <w:r/>
             <w:r>
               <w:rPr>
                 <w:rFonts w:ascii="Times New Roman" w:hAnsi="Times New Roman"/>
@@ -2671,6 +2729,7 @@
               <w:spacing w:line="276" w:lineRule="auto" w:before="20" w:after="40"/>
               <w:jc w:val="left"/>
             </w:pPr>
+            <w:r/>
             <w:r>
               <w:rPr>
                 <w:rFonts w:ascii="Times New Roman" w:hAnsi="Times New Roman"/>
@@ -2723,6 +2782,7 @@
               <w:spacing w:line="276" w:lineRule="auto" w:before="20" w:after="40"/>
               <w:jc w:val="left"/>
             </w:pPr>
+            <w:r/>
             <w:r>
               <w:rPr>
                 <w:rFonts w:ascii="Times New Roman" w:hAnsi="Times New Roman"/>
@@ -2788,6 +2848,7 @@
               <w:spacing w:line="276" w:lineRule="auto" w:before="20" w:after="40"/>
               <w:jc w:val="left"/>
             </w:pPr>
+            <w:r/>
             <w:r>
               <w:rPr>
                 <w:rFonts w:ascii="Times New Roman" w:hAnsi="Times New Roman"/>
@@ -2828,6 +2889,7 @@
               <w:spacing w:line="276" w:lineRule="auto" w:before="20" w:after="40"/>
               <w:jc w:val="left"/>
             </w:pPr>
+            <w:r/>
             <w:r>
               <w:rPr>
                 <w:rFonts w:ascii="Times New Roman" w:hAnsi="Times New Roman"/>
@@ -2867,6 +2929,7 @@
               <w:spacing w:line="276" w:lineRule="auto" w:before="20" w:after="40"/>
               <w:jc w:val="left"/>
             </w:pPr>
+            <w:r/>
             <w:r>
               <w:rPr>
                 <w:rFonts w:ascii="Times New Roman" w:hAnsi="Times New Roman"/>
@@ -2905,6 +2968,7 @@
               <w:spacing w:line="276" w:lineRule="auto" w:before="20" w:after="40"/>
               <w:jc w:val="left"/>
             </w:pPr>
+            <w:r/>
             <w:r>
               <w:rPr>
                 <w:rFonts w:ascii="Times New Roman" w:hAnsi="Times New Roman"/>
@@ -2958,6 +3022,7 @@
               <w:spacing w:line="276" w:lineRule="auto" w:before="20" w:after="40"/>
               <w:jc w:val="center"/>
             </w:pPr>
+            <w:r/>
             <w:r>
               <w:rPr>
                 <w:rFonts w:ascii="Times New Roman" w:hAnsi="Times New Roman"/>
@@ -2989,6 +3054,7 @@
               <w:spacing w:line="276" w:lineRule="auto" w:before="20" w:after="40"/>
               <w:jc w:val="center"/>
             </w:pPr>
+            <w:r/>
             <w:r>
               <w:rPr>
                 <w:rFonts w:ascii="Times New Roman" w:hAnsi="Times New Roman"/>
@@ -3016,6 +3082,7 @@
               <w:spacing w:line="276" w:lineRule="auto" w:before="20" w:after="40"/>
               <w:jc w:val="center"/>
             </w:pPr>
+            <w:r/>
             <w:r>
               <w:rPr>
                 <w:rFonts w:ascii="Times New Roman" w:hAnsi="Times New Roman"/>
@@ -3055,6 +3122,7 @@
               <w:spacing w:line="276" w:lineRule="auto" w:before="20" w:after="40"/>
               <w:jc w:val="left"/>
             </w:pPr>
+            <w:r/>
             <w:r>
               <w:rPr>
                 <w:rFonts w:ascii="Times New Roman" w:hAnsi="Times New Roman"/>
@@ -3108,6 +3176,7 @@
               <w:spacing w:line="276" w:lineRule="auto" w:before="20" w:after="40"/>
               <w:jc w:val="left"/>
             </w:pPr>
+            <w:r/>
             <w:r>
               <w:rPr>
                 <w:rFonts w:ascii="Times New Roman" w:hAnsi="Times New Roman"/>
@@ -3187,6 +3256,7 @@
               <w:spacing w:line="276" w:lineRule="auto" w:before="20" w:after="40"/>
               <w:jc w:val="left"/>
             </w:pPr>
+            <w:r/>
             <w:r>
               <w:rPr>
                 <w:rFonts w:ascii="Times New Roman" w:hAnsi="Times New Roman"/>
@@ -3228,6 +3298,7 @@
               <w:spacing w:line="276" w:lineRule="auto" w:before="20" w:after="40"/>
               <w:jc w:val="left"/>
             </w:pPr>
+            <w:r/>
             <w:r>
               <w:rPr>
                 <w:rFonts w:ascii="Times New Roman" w:hAnsi="Times New Roman"/>
@@ -3268,6 +3339,7 @@
               <w:spacing w:line="276" w:lineRule="auto" w:before="20" w:after="40"/>
               <w:jc w:val="left"/>
             </w:pPr>
+            <w:r/>
             <w:r>
               <w:rPr>
                 <w:rFonts w:ascii="Times New Roman" w:hAnsi="Times New Roman"/>
@@ -3307,6 +3379,7 @@
               <w:spacing w:line="276" w:lineRule="auto" w:before="20" w:after="40"/>
               <w:jc w:val="left"/>
             </w:pPr>
+            <w:r/>
             <w:r>
               <w:rPr>
                 <w:rFonts w:ascii="Times New Roman" w:hAnsi="Times New Roman"/>
@@ -3346,6 +3419,7 @@
               <w:spacing w:line="276" w:lineRule="auto" w:before="20" w:after="40"/>
               <w:jc w:val="center"/>
             </w:pPr>
+            <w:r/>
             <w:r>
               <w:rPr>
                 <w:rFonts w:ascii="Times New Roman" w:hAnsi="Times New Roman"/>
@@ -3376,6 +3450,7 @@
               <w:spacing w:line="276" w:lineRule="auto" w:before="20" w:after="40"/>
               <w:jc w:val="center"/>
             </w:pPr>
+            <w:r/>
             <w:r>
               <w:rPr>
                 <w:rFonts w:ascii="Times New Roman" w:hAnsi="Times New Roman"/>
@@ -3402,6 +3477,7 @@
               <w:spacing w:line="276" w:lineRule="auto" w:before="20" w:after="40"/>
               <w:jc w:val="center"/>
             </w:pPr>
+            <w:r/>
             <w:r>
               <w:rPr>
                 <w:rFonts w:ascii="Times New Roman" w:hAnsi="Times New Roman"/>
@@ -3440,6 +3516,7 @@
               <w:spacing w:line="276" w:lineRule="auto" w:before="20" w:after="40"/>
               <w:jc w:val="left"/>
             </w:pPr>
+            <w:r/>
             <w:r>
               <w:rPr>
                 <w:rFonts w:ascii="Times New Roman" w:hAnsi="Times New Roman"/>
@@ -3492,6 +3569,7 @@
               <w:spacing w:line="276" w:lineRule="auto" w:before="20" w:after="40"/>
               <w:jc w:val="left"/>
             </w:pPr>
+            <w:r/>
             <w:r>
               <w:rPr>
                 <w:rFonts w:ascii="Times New Roman" w:hAnsi="Times New Roman"/>
@@ -3570,6 +3648,7 @@
               <w:spacing w:line="276" w:lineRule="auto" w:before="20" w:after="40"/>
               <w:jc w:val="left"/>
             </w:pPr>
+            <w:r/>
             <w:r>
               <w:rPr>
                 <w:rFonts w:ascii="Times New Roman" w:hAnsi="Times New Roman"/>
@@ -3610,6 +3689,7 @@
               <w:spacing w:line="276" w:lineRule="auto" w:before="20" w:after="40"/>
               <w:jc w:val="left"/>
             </w:pPr>
+            <w:r/>
             <w:r>
               <w:rPr>
                 <w:rFonts w:ascii="Times New Roman" w:hAnsi="Times New Roman"/>
@@ -3649,6 +3729,7 @@
               <w:spacing w:line="276" w:lineRule="auto" w:before="20" w:after="40"/>
               <w:jc w:val="left"/>
             </w:pPr>
+            <w:r/>
             <w:r>
               <w:rPr>
                 <w:rFonts w:ascii="Times New Roman" w:hAnsi="Times New Roman"/>
@@ -3687,6 +3768,7 @@
               <w:spacing w:line="276" w:lineRule="auto" w:before="20" w:after="40"/>
               <w:jc w:val="left"/>
             </w:pPr>
+            <w:r/>
             <w:r>
               <w:rPr>
                 <w:rFonts w:ascii="Times New Roman" w:hAnsi="Times New Roman"/>
@@ -3740,6 +3822,7 @@
               <w:spacing w:line="276" w:lineRule="auto" w:before="20" w:after="40"/>
               <w:jc w:val="center"/>
             </w:pPr>
+            <w:r/>
             <w:r>
               <w:rPr>
                 <w:rFonts w:ascii="Times New Roman" w:hAnsi="Times New Roman"/>
@@ -3771,6 +3854,7 @@
               <w:spacing w:line="276" w:lineRule="auto" w:before="20" w:after="40"/>
               <w:jc w:val="center"/>
             </w:pPr>
+            <w:r/>
             <w:r>
               <w:rPr>
                 <w:rFonts w:ascii="Times New Roman" w:hAnsi="Times New Roman"/>
@@ -3798,6 +3882,7 @@
               <w:spacing w:line="276" w:lineRule="auto" w:before="20" w:after="40"/>
               <w:jc w:val="center"/>
             </w:pPr>
+            <w:r/>
             <w:r>
               <w:rPr>
                 <w:rFonts w:ascii="Times New Roman" w:hAnsi="Times New Roman"/>
@@ -3837,6 +3922,7 @@
               <w:spacing w:line="276" w:lineRule="auto" w:before="20" w:after="40"/>
               <w:jc w:val="left"/>
             </w:pPr>
+            <w:r/>
             <w:r>
               <w:rPr>
                 <w:rFonts w:ascii="Times New Roman" w:hAnsi="Times New Roman"/>
@@ -3890,6 +3976,7 @@
               <w:spacing w:line="276" w:lineRule="auto" w:before="20" w:after="40"/>
               <w:jc w:val="left"/>
             </w:pPr>
+            <w:r/>
             <w:r>
               <w:rPr>
                 <w:rFonts w:ascii="Times New Roman" w:hAnsi="Times New Roman"/>
@@ -3969,6 +4056,7 @@
               <w:spacing w:line="276" w:lineRule="auto" w:before="20" w:after="40"/>
               <w:jc w:val="left"/>
             </w:pPr>
+            <w:r/>
             <w:r>
               <w:rPr>
                 <w:rFonts w:ascii="Times New Roman" w:hAnsi="Times New Roman"/>
@@ -4010,6 +4098,7 @@
               <w:spacing w:line="276" w:lineRule="auto" w:before="20" w:after="40"/>
               <w:jc w:val="left"/>
             </w:pPr>
+            <w:r/>
             <w:r>
               <w:rPr>
                 <w:rFonts w:ascii="Times New Roman" w:hAnsi="Times New Roman"/>
@@ -4050,6 +4139,7 @@
               <w:spacing w:line="276" w:lineRule="auto" w:before="20" w:after="40"/>
               <w:jc w:val="left"/>
             </w:pPr>
+            <w:r/>
             <w:r>
               <w:rPr>
                 <w:rFonts w:ascii="Times New Roman" w:hAnsi="Times New Roman"/>
@@ -4089,6 +4179,7 @@
               <w:spacing w:line="276" w:lineRule="auto" w:before="20" w:after="40"/>
               <w:jc w:val="left"/>
             </w:pPr>
+            <w:r/>
             <w:r>
               <w:rPr>
                 <w:rFonts w:ascii="Times New Roman" w:hAnsi="Times New Roman"/>
@@ -4143,6 +4234,7 @@
               <w:spacing w:line="276" w:lineRule="auto" w:before="20" w:after="40"/>
               <w:jc w:val="center"/>
             </w:pPr>
+            <w:r/>
             <w:r>
               <w:rPr>
                 <w:rFonts w:ascii="Times New Roman" w:hAnsi="Times New Roman"/>
@@ -4173,6 +4265,7 @@
               <w:spacing w:line="276" w:lineRule="auto" w:before="20" w:after="40"/>
               <w:jc w:val="center"/>
             </w:pPr>
+            <w:r/>
             <w:r>
               <w:rPr>
                 <w:rFonts w:ascii="Times New Roman" w:hAnsi="Times New Roman"/>
@@ -4199,6 +4292,7 @@
               <w:spacing w:line="276" w:lineRule="auto" w:before="20" w:after="40"/>
               <w:jc w:val="center"/>
             </w:pPr>
+            <w:r/>
             <w:r>
               <w:rPr>
                 <w:rFonts w:ascii="Times New Roman" w:hAnsi="Times New Roman"/>
@@ -4237,6 +4331,7 @@
               <w:spacing w:line="276" w:lineRule="auto" w:before="20" w:after="40"/>
               <w:jc w:val="left"/>
             </w:pPr>
+            <w:r/>
             <w:r>
               <w:rPr>
                 <w:rFonts w:ascii="Times New Roman" w:hAnsi="Times New Roman"/>
@@ -4289,6 +4384,7 @@
               <w:spacing w:line="276" w:lineRule="auto" w:before="20" w:after="40"/>
               <w:jc w:val="left"/>
             </w:pPr>
+            <w:r/>
             <w:r>
               <w:rPr>
                 <w:rFonts w:ascii="Times New Roman" w:hAnsi="Times New Roman"/>
@@ -4367,6 +4463,7 @@
               <w:spacing w:line="276" w:lineRule="auto" w:before="20" w:after="40"/>
               <w:jc w:val="left"/>
             </w:pPr>
+            <w:r/>
             <w:r>
               <w:rPr>
                 <w:rFonts w:ascii="Times New Roman" w:hAnsi="Times New Roman"/>
@@ -4407,6 +4504,7 @@
               <w:spacing w:line="276" w:lineRule="auto" w:before="20" w:after="40"/>
               <w:jc w:val="left"/>
             </w:pPr>
+            <w:r/>
             <w:r>
               <w:rPr>
                 <w:rFonts w:ascii="Times New Roman" w:hAnsi="Times New Roman"/>
@@ -4446,6 +4544,7 @@
               <w:spacing w:line="276" w:lineRule="auto" w:before="20" w:after="40"/>
               <w:jc w:val="left"/>
             </w:pPr>
+            <w:r/>
             <w:r>
               <w:rPr>
                 <w:rFonts w:ascii="Times New Roman" w:hAnsi="Times New Roman"/>
@@ -4484,6 +4583,7 @@
               <w:spacing w:line="276" w:lineRule="auto" w:before="20" w:after="40"/>
               <w:jc w:val="left"/>
             </w:pPr>
+            <w:r/>
             <w:r>
               <w:rPr>
                 <w:rFonts w:ascii="Times New Roman" w:hAnsi="Times New Roman"/>
@@ -4522,6 +4622,7 @@
               <w:spacing w:line="276" w:lineRule="auto" w:before="20" w:after="40"/>
               <w:jc w:val="center"/>
             </w:pPr>
+            <w:r/>
             <w:r>
               <w:rPr>
                 <w:rFonts w:ascii="Times New Roman" w:hAnsi="Times New Roman"/>
@@ -4553,6 +4654,7 @@
               <w:spacing w:line="276" w:lineRule="auto" w:before="20" w:after="40"/>
               <w:jc w:val="center"/>
             </w:pPr>
+            <w:r/>
             <w:r>
               <w:rPr>
                 <w:rFonts w:ascii="Times New Roman" w:hAnsi="Times New Roman"/>
@@ -4580,6 +4682,7 @@
               <w:spacing w:line="276" w:lineRule="auto" w:before="20" w:after="40"/>
               <w:jc w:val="center"/>
             </w:pPr>
+            <w:r/>
             <w:r>
               <w:rPr>
                 <w:rFonts w:ascii="Times New Roman" w:hAnsi="Times New Roman"/>
@@ -4619,6 +4722,7 @@
               <w:spacing w:line="276" w:lineRule="auto" w:before="20" w:after="40"/>
               <w:jc w:val="left"/>
             </w:pPr>
+            <w:r/>
             <w:r>
               <w:rPr>
                 <w:rFonts w:ascii="Times New Roman" w:hAnsi="Times New Roman"/>
@@ -4672,6 +4776,7 @@
               <w:spacing w:line="276" w:lineRule="auto" w:before="20" w:after="40"/>
               <w:jc w:val="left"/>
             </w:pPr>
+            <w:r/>
             <w:r>
               <w:rPr>
                 <w:rFonts w:ascii="Times New Roman" w:hAnsi="Times New Roman"/>
@@ -4751,6 +4856,7 @@
               <w:spacing w:line="276" w:lineRule="auto" w:before="20" w:after="40"/>
               <w:jc w:val="left"/>
             </w:pPr>
+            <w:r/>
             <w:r>
               <w:rPr>
                 <w:rFonts w:ascii="Times New Roman" w:hAnsi="Times New Roman"/>
@@ -4792,6 +4898,7 @@
               <w:spacing w:line="276" w:lineRule="auto" w:before="20" w:after="40"/>
               <w:jc w:val="left"/>
             </w:pPr>
+            <w:r/>
             <w:r>
               <w:rPr>
                 <w:rFonts w:ascii="Times New Roman" w:hAnsi="Times New Roman"/>
@@ -4832,6 +4939,7 @@
               <w:spacing w:line="276" w:lineRule="auto" w:before="20" w:after="40"/>
               <w:jc w:val="left"/>
             </w:pPr>
+            <w:r/>
             <w:r>
               <w:rPr>
                 <w:rFonts w:ascii="Times New Roman" w:hAnsi="Times New Roman"/>
@@ -4871,6 +4979,7 @@
               <w:spacing w:line="276" w:lineRule="auto" w:before="20" w:after="40"/>
               <w:jc w:val="left"/>
             </w:pPr>
+            <w:r/>
             <w:r>
               <w:rPr>
                 <w:rFonts w:ascii="Times New Roman" w:hAnsi="Times New Roman"/>
@@ -4925,6 +5034,7 @@
               <w:spacing w:line="276" w:lineRule="auto" w:before="20" w:after="40"/>
               <w:jc w:val="center"/>
             </w:pPr>
+            <w:r/>
             <w:r>
               <w:rPr>
                 <w:rFonts w:ascii="Times New Roman" w:hAnsi="Times New Roman"/>
@@ -4955,6 +5065,7 @@
               <w:spacing w:line="276" w:lineRule="auto" w:before="20" w:after="40"/>
               <w:jc w:val="center"/>
             </w:pPr>
+            <w:r/>
             <w:r>
               <w:rPr>
                 <w:rFonts w:ascii="Times New Roman" w:hAnsi="Times New Roman"/>
@@ -4981,6 +5092,7 @@
               <w:spacing w:line="276" w:lineRule="auto" w:before="20" w:after="40"/>
               <w:jc w:val="center"/>
             </w:pPr>
+            <w:r/>
             <w:r>
               <w:rPr>
                 <w:rFonts w:ascii="Times New Roman" w:hAnsi="Times New Roman"/>
@@ -5019,6 +5131,7 @@
               <w:spacing w:line="276" w:lineRule="auto" w:before="20" w:after="40"/>
               <w:jc w:val="left"/>
             </w:pPr>
+            <w:r/>
             <w:r>
               <w:rPr>
                 <w:rFonts w:ascii="Times New Roman" w:hAnsi="Times New Roman"/>
@@ -5043,6 +5156,7 @@
               <w:spacing w:line="276" w:lineRule="auto" w:before="20" w:after="40"/>
               <w:jc w:val="left"/>
             </w:pPr>
+            <w:r/>
             <w:r>
               <w:rPr>
                 <w:rFonts w:ascii="Times New Roman" w:hAnsi="Times New Roman"/>
@@ -5067,6 +5181,7 @@
               <w:spacing w:line="276" w:lineRule="auto" w:before="20" w:after="40"/>
               <w:jc w:val="left"/>
             </w:pPr>
+            <w:r/>
             <w:r>
               <w:rPr>
                 <w:rFonts w:ascii="Times New Roman" w:hAnsi="Times New Roman"/>
@@ -5091,6 +5206,7 @@
               <w:spacing w:line="276" w:lineRule="auto" w:before="20" w:after="40"/>
               <w:jc w:val="left"/>
             </w:pPr>
+            <w:r/>
             <w:r>
               <w:rPr>
                 <w:rFonts w:ascii="Times New Roman" w:hAnsi="Times New Roman"/>
@@ -5115,6 +5231,7 @@
               <w:spacing w:line="276" w:lineRule="auto" w:before="20" w:after="40"/>
               <w:jc w:val="left"/>
             </w:pPr>
+            <w:r/>
             <w:r>
               <w:rPr>
                 <w:rFonts w:ascii="Times New Roman" w:hAnsi="Times New Roman"/>
@@ -5139,6 +5256,7 @@
               <w:spacing w:line="276" w:lineRule="auto" w:before="20" w:after="40"/>
               <w:jc w:val="left"/>
             </w:pPr>
+            <w:r/>
             <w:r>
               <w:rPr>
                 <w:rFonts w:ascii="Times New Roman" w:hAnsi="Times New Roman"/>
@@ -5163,6 +5281,7 @@
               <w:spacing w:line="276" w:lineRule="auto" w:before="20" w:after="40"/>
               <w:jc w:val="center"/>
             </w:pPr>
+            <w:r/>
             <w:r>
               <w:rPr>
                 <w:rFonts w:ascii="Times New Roman" w:hAnsi="Times New Roman"/>
@@ -5193,6 +5312,7 @@
               <w:spacing w:line="276" w:lineRule="auto" w:before="20" w:after="40"/>
               <w:jc w:val="center"/>
             </w:pPr>
+            <w:r/>
             <w:r>
               <w:rPr>
                 <w:rFonts w:ascii="Times New Roman" w:hAnsi="Times New Roman"/>
@@ -5220,6 +5340,7 @@
               <w:spacing w:line="276" w:lineRule="auto" w:before="20" w:after="40"/>
               <w:jc w:val="center"/>
             </w:pPr>
+            <w:r/>
             <w:r>
               <w:rPr>
                 <w:rFonts w:ascii="Times New Roman" w:hAnsi="Times New Roman"/>
@@ -5259,6 +5380,7 @@
               <w:spacing w:line="276" w:lineRule="auto" w:before="20" w:after="40"/>
               <w:jc w:val="left"/>
             </w:pPr>
+            <w:r/>
             <w:r>
               <w:rPr>
                 <w:rFonts w:ascii="Times New Roman" w:hAnsi="Times New Roman"/>
@@ -5284,6 +5406,7 @@
               <w:spacing w:line="276" w:lineRule="auto" w:before="20" w:after="40"/>
               <w:jc w:val="left"/>
             </w:pPr>
+            <w:r/>
             <w:r>
               <w:rPr>
                 <w:rFonts w:ascii="Times New Roman" w:hAnsi="Times New Roman"/>
@@ -5309,6 +5432,7 @@
               <w:spacing w:line="276" w:lineRule="auto" w:before="20" w:after="40"/>
               <w:jc w:val="left"/>
             </w:pPr>
+            <w:r/>
             <w:r>
               <w:rPr>
                 <w:rFonts w:ascii="Times New Roman" w:hAnsi="Times New Roman"/>
@@ -5334,6 +5458,7 @@
               <w:spacing w:line="276" w:lineRule="auto" w:before="20" w:after="40"/>
               <w:jc w:val="left"/>
             </w:pPr>
+            <w:r/>
             <w:r>
               <w:rPr>
                 <w:rFonts w:ascii="Times New Roman" w:hAnsi="Times New Roman"/>
@@ -5359,6 +5484,7 @@
               <w:spacing w:line="276" w:lineRule="auto" w:before="20" w:after="40"/>
               <w:jc w:val="left"/>
             </w:pPr>
+            <w:r/>
             <w:r>
               <w:rPr>
                 <w:rFonts w:ascii="Times New Roman" w:hAnsi="Times New Roman"/>
@@ -5384,6 +5510,7 @@
               <w:spacing w:line="276" w:lineRule="auto" w:before="20" w:after="40"/>
               <w:jc w:val="left"/>
             </w:pPr>
+            <w:r/>
             <w:r>
               <w:rPr>
                 <w:rFonts w:ascii="Times New Roman" w:hAnsi="Times New Roman"/>
@@ -5409,6 +5536,7 @@
               <w:spacing w:line="276" w:lineRule="auto" w:before="20" w:after="40"/>
               <w:jc w:val="center"/>
             </w:pPr>
+            <w:r/>
             <w:r>
               <w:rPr>
                 <w:rFonts w:ascii="Times New Roman" w:hAnsi="Times New Roman"/>
@@ -5438,6 +5566,7 @@
               <w:spacing w:line="276" w:lineRule="auto" w:before="20" w:after="40"/>
               <w:jc w:val="center"/>
             </w:pPr>
+            <w:r/>
             <w:r>
               <w:rPr>
                 <w:rFonts w:ascii="Times New Roman" w:hAnsi="Times New Roman"/>
@@ -5464,6 +5593,7 @@
               <w:spacing w:line="276" w:lineRule="auto" w:before="20" w:after="40"/>
               <w:jc w:val="center"/>
             </w:pPr>
+            <w:r/>
             <w:r>
               <w:rPr>
                 <w:rFonts w:ascii="Times New Roman" w:hAnsi="Times New Roman"/>
@@ -5502,6 +5632,7 @@
               <w:spacing w:line="276" w:lineRule="auto" w:before="20" w:after="40"/>
               <w:jc w:val="left"/>
             </w:pPr>
+            <w:r/>
             <w:r>
               <w:rPr>
                 <w:rFonts w:ascii="Times New Roman" w:hAnsi="Times New Roman"/>
@@ -5526,6 +5657,7 @@
               <w:spacing w:line="276" w:lineRule="auto" w:before="20" w:after="40"/>
               <w:jc w:val="left"/>
             </w:pPr>
+            <w:r/>
             <w:r>
               <w:rPr>
                 <w:rFonts w:ascii="Times New Roman" w:hAnsi="Times New Roman"/>
@@ -5550,6 +5682,7 @@
               <w:spacing w:line="276" w:lineRule="auto" w:before="20" w:after="40"/>
               <w:jc w:val="left"/>
             </w:pPr>
+            <w:r/>
             <w:r>
               <w:rPr>
                 <w:rFonts w:ascii="Times New Roman" w:hAnsi="Times New Roman"/>
@@ -5574,6 +5707,7 @@
               <w:spacing w:line="276" w:lineRule="auto" w:before="20" w:after="40"/>
               <w:jc w:val="left"/>
             </w:pPr>
+            <w:r/>
             <w:r>
               <w:rPr>
                 <w:rFonts w:ascii="Times New Roman" w:hAnsi="Times New Roman"/>
@@ -5598,6 +5732,7 @@
               <w:spacing w:line="276" w:lineRule="auto" w:before="20" w:after="40"/>
               <w:jc w:val="left"/>
             </w:pPr>
+            <w:r/>
             <w:r>
               <w:rPr>
                 <w:rFonts w:ascii="Times New Roman" w:hAnsi="Times New Roman"/>
@@ -5622,6 +5757,7 @@
               <w:spacing w:line="276" w:lineRule="auto" w:before="20" w:after="40"/>
               <w:jc w:val="left"/>
             </w:pPr>
+            <w:r/>
             <w:r>
               <w:rPr>
                 <w:rFonts w:ascii="Times New Roman" w:hAnsi="Times New Roman"/>
@@ -5646,6 +5782,7 @@
               <w:spacing w:line="276" w:lineRule="auto" w:before="20" w:after="40"/>
               <w:jc w:val="center"/>
             </w:pPr>
+            <w:r/>
             <w:r>
               <w:rPr>
                 <w:rFonts w:ascii="Times New Roman" w:hAnsi="Times New Roman"/>
@@ -5676,6 +5813,7 @@
               <w:spacing w:line="276" w:lineRule="auto" w:before="20" w:after="40"/>
               <w:jc w:val="center"/>
             </w:pPr>
+            <w:r/>
             <w:r>
               <w:rPr>
                 <w:rFonts w:ascii="Times New Roman" w:hAnsi="Times New Roman"/>
@@ -5703,6 +5841,7 @@
               <w:spacing w:line="276" w:lineRule="auto" w:before="20" w:after="40"/>
               <w:jc w:val="center"/>
             </w:pPr>
+            <w:r/>
             <w:r>
               <w:rPr>
                 <w:rFonts w:ascii="Times New Roman" w:hAnsi="Times New Roman"/>
@@ -5742,6 +5881,7 @@
               <w:spacing w:line="276" w:lineRule="auto" w:before="20" w:after="40"/>
               <w:jc w:val="left"/>
             </w:pPr>
+            <w:r/>
             <w:r>
               <w:rPr>
                 <w:rFonts w:ascii="Times New Roman" w:hAnsi="Times New Roman"/>
@@ -5767,6 +5907,7 @@
               <w:spacing w:line="276" w:lineRule="auto" w:before="20" w:after="40"/>
               <w:jc w:val="left"/>
             </w:pPr>
+            <w:r/>
             <w:r>
               <w:rPr>
                 <w:rFonts w:ascii="Times New Roman" w:hAnsi="Times New Roman"/>
@@ -5792,6 +5933,7 @@
               <w:spacing w:line="276" w:lineRule="auto" w:before="20" w:after="40"/>
               <w:jc w:val="left"/>
             </w:pPr>
+            <w:r/>
             <w:r>
               <w:rPr>
                 <w:rFonts w:ascii="Times New Roman" w:hAnsi="Times New Roman"/>
@@ -5817,6 +5959,7 @@
               <w:spacing w:line="276" w:lineRule="auto" w:before="20" w:after="40"/>
               <w:jc w:val="left"/>
             </w:pPr>
+            <w:r/>
             <w:r>
               <w:rPr>
                 <w:rFonts w:ascii="Times New Roman" w:hAnsi="Times New Roman"/>
@@ -5842,6 +5985,7 @@
               <w:spacing w:line="276" w:lineRule="auto" w:before="20" w:after="40"/>
               <w:jc w:val="left"/>
             </w:pPr>
+            <w:r/>
             <w:r>
               <w:rPr>
                 <w:rFonts w:ascii="Times New Roman" w:hAnsi="Times New Roman"/>
@@ -5867,6 +6011,7 @@
               <w:spacing w:line="276" w:lineRule="auto" w:before="20" w:after="40"/>
               <w:jc w:val="left"/>
             </w:pPr>
+            <w:r/>
             <w:r>
               <w:rPr>
                 <w:rFonts w:ascii="Times New Roman" w:hAnsi="Times New Roman"/>
@@ -5892,6 +6037,7 @@
               <w:spacing w:line="276" w:lineRule="auto" w:before="20" w:after="40"/>
               <w:jc w:val="center"/>
             </w:pPr>
+            <w:r/>
             <w:r>
               <w:rPr>
                 <w:rFonts w:ascii="Times New Roman" w:hAnsi="Times New Roman"/>
@@ -5921,6 +6067,7 @@
               <w:spacing w:line="276" w:lineRule="auto" w:before="20" w:after="40"/>
               <w:jc w:val="center"/>
             </w:pPr>
+            <w:r/>
             <w:r>
               <w:rPr>
                 <w:rFonts w:ascii="Times New Roman" w:hAnsi="Times New Roman"/>
@@ -5947,6 +6094,7 @@
               <w:spacing w:line="276" w:lineRule="auto" w:before="20" w:after="40"/>
               <w:jc w:val="center"/>
             </w:pPr>
+            <w:r/>
             <w:r>
               <w:rPr>
                 <w:rFonts w:ascii="Times New Roman" w:hAnsi="Times New Roman"/>
@@ -5985,6 +6133,7 @@
               <w:spacing w:line="276" w:lineRule="auto" w:before="20" w:after="40"/>
               <w:jc w:val="left"/>
             </w:pPr>
+            <w:r/>
             <w:r>
               <w:rPr>
                 <w:rFonts w:ascii="Times New Roman" w:hAnsi="Times New Roman"/>
@@ -6009,6 +6158,7 @@
               <w:spacing w:line="276" w:lineRule="auto" w:before="20" w:after="40"/>
               <w:jc w:val="left"/>
             </w:pPr>
+            <w:r/>
             <w:r>
               <w:rPr>
                 <w:rFonts w:ascii="Times New Roman" w:hAnsi="Times New Roman"/>
@@ -6033,6 +6183,7 @@
               <w:spacing w:line="276" w:lineRule="auto" w:before="20" w:after="40"/>
               <w:jc w:val="left"/>
             </w:pPr>
+            <w:r/>
             <w:r>
               <w:rPr>
                 <w:rFonts w:ascii="Times New Roman" w:hAnsi="Times New Roman"/>
@@ -6057,6 +6208,7 @@
               <w:spacing w:line="276" w:lineRule="auto" w:before="20" w:after="40"/>
               <w:jc w:val="left"/>
             </w:pPr>
+            <w:r/>
             <w:r>
               <w:rPr>
                 <w:rFonts w:ascii="Times New Roman" w:hAnsi="Times New Roman"/>
@@ -6081,6 +6233,7 @@
               <w:spacing w:line="276" w:lineRule="auto" w:before="20" w:after="40"/>
               <w:jc w:val="left"/>
             </w:pPr>
+            <w:r/>
             <w:r>
               <w:rPr>
                 <w:rFonts w:ascii="Times New Roman" w:hAnsi="Times New Roman"/>
@@ -6105,6 +6258,7 @@
               <w:spacing w:line="276" w:lineRule="auto" w:before="20" w:after="40"/>
               <w:jc w:val="left"/>
             </w:pPr>
+            <w:r/>
             <w:r>
               <w:rPr>
                 <w:rFonts w:ascii="Times New Roman" w:hAnsi="Times New Roman"/>
@@ -6803,11 +6957,6 @@
     <w:name w:val="Normal"/>
     <w:qFormat/>
     <w:rsid w:val="00FC693F"/>
-    <w:rPr>
-      <w:rFonts w:ascii="Times New Roman" w:hAnsi="Times New Roman"/>
-      <w:color w:val="000000"/>
-      <w:sz w:val="26"/>
-    </w:rPr>
   </w:style>
   <w:style w:type="paragraph" w:styleId="Header">
     <w:name w:val="header"/>

</xml_diff>